<commit_message>
docs: integra sistemas internos, foco em pessoas e remove dados mock
- Integra sistemas internos existentes (projetos/contratos/comercial,
  vibe coding) como conectores; agentes PMO e Contratos.
- Remove grafico de resultados com numeros ficticios; substitui por
  framework de indicadores medidos na propria operacao.
- Nova secao 'Pessoas no centro': clima, seguranca psicologica e
  melhores condicoes de trabalho (+ figura).
- Atualiza camadas, roadmap e tabela de agentes; alinha .md e .docx.
</commit_message>
<xml_diff>
--- a/docs/Infraestrutura-IA-setup.com.br.docx
+++ b/docs/Infraestrutura-IA-setup.com.br.docx
@@ -286,7 +286,7 @@
           <w:color w:val="212B36"/>
           <w:sz w:val="22"/>
         </w:rPr>
-        <w:t>O diferencial não é “conversar com um chatbot”, e sim ter agentes que operam de verdade: leem e-mails, organizam a agenda, geram documentos no Drive, respondem clientes no WhatsApp e automatizam rotinas — sempre sob controle humano nas decisões críticas. Para isso combinamos três pilares:</w:t>
+        <w:t>O diferencial não é “conversar com um chatbot”, e sim ter agentes que operam de verdade: leem e-mails, organizam a agenda, geram documentos no Drive, respondem clientes no WhatsApp e atuam sobre os sistemas internos já existentes (projetos, contratos e comercial) — sempre sob controle humano nas decisões críticas. Para isso combinamos três pilares:</w:t>
       </w:r>
     </w:p>
     <w:p>
@@ -364,7 +364,7 @@
           <w:color w:val="212B36"/>
           <w:sz w:val="22"/>
         </w:rPr>
-        <w:t>um padrão único que conecta a IA aos sistemas reais (WhatsApp, Gmail, Calendar, Drive, GitHub).</w:t>
+        <w:t>um padrão único que conecta a IA aos sistemas reais (WhatsApp, Google Workspace, projetos, contratos e comercial).</w:t>
       </w:r>
     </w:p>
     <w:tbl>
@@ -417,7 +417,7 @@
                 <w:color w:val="212B36"/>
                 <w:sz w:val="22"/>
               </w:rPr>
-              <w:t>menos tempo em tarefas repetitivas, respostas mais rápidas a clientes e mais qualidade nos entregáveis — com governança, segurança e custo sob controle.</w:t>
+              <w:t>menos tempo em tarefas repetitivas e mais qualidade nos entregáveis — e, no mesmo movimento, equipes menos sobrecarregadas, com mais segurança psicológica e melhores condições de trabalho, sob governança e custo controlados.</w:t>
             </w:r>
           </w:p>
         </w:tc>
@@ -1599,7 +1599,7 @@
                 <w:color w:val="212B36"/>
                 <w:sz w:val="19"/>
               </w:rPr>
-              <w:t>WhatsApp, Calendar, CRM</w:t>
+              <w:t>WhatsApp, sist. Comercial</w:t>
             </w:r>
           </w:p>
         </w:tc>
@@ -1628,7 +1628,7 @@
                 <w:color w:val="0F2740"/>
                 <w:sz w:val="19"/>
               </w:rPr>
-              <w:t>Operações de Documentos</w:t>
+              <w:t>PMO / Projetos</w:t>
             </w:r>
           </w:p>
         </w:tc>
@@ -1655,7 +1655,7 @@
                 <w:color w:val="212B36"/>
                 <w:sz w:val="19"/>
               </w:rPr>
-              <w:t>Gera e organiza propostas, contratos e relatórios; OCR de notas.</w:t>
+              <w:t>Atualiza status, gera relatórios e antecipa riscos nos projetos.</w:t>
             </w:r>
           </w:p>
         </w:tc>
@@ -1682,7 +1682,7 @@
                 <w:color w:val="212B36"/>
                 <w:sz w:val="19"/>
               </w:rPr>
-              <w:t>Drive, visão/OCR</w:t>
+              <w:t>sist. Projetos, Drive</w:t>
             </w:r>
           </w:p>
         </w:tc>
@@ -1711,7 +1711,7 @@
                 <w:color w:val="0F2740"/>
                 <w:sz w:val="19"/>
               </w:rPr>
-              <w:t>Suporte / IT Helpdesk</w:t>
+              <w:t>Contratos</w:t>
             </w:r>
           </w:p>
         </w:tc>
@@ -1738,6 +1738,89 @@
                 <w:color w:val="212B36"/>
                 <w:sz w:val="19"/>
               </w:rPr>
+              <w:t>Gera, organiza e acompanha prazos de contratos; OCR de documentos.</w:t>
+            </w:r>
+          </w:p>
+        </w:tc>
+        <w:tc>
+          <w:tcPr>
+            <w:tcW w:type="dxa" w:w="2016"/>
+            <w:tcMar>
+              <w:top w:w="80" w:type="dxa"/>
+              <w:bottom w:w="80" w:type="dxa"/>
+              <w:start w:w="120" w:type="dxa"/>
+              <w:end w:w="120" w:type="dxa"/>
+            </w:tcMar>
+            <w:shd w:val="clear" w:fill="FFFFFF"/>
+          </w:tcPr>
+          <w:p>
+            <w:pPr>
+              <w:spacing w:after="0"/>
+            </w:pPr>
+            <w:r>
+              <w:rPr>
+                <w:rFonts w:ascii="Calibri" w:hAnsi="Calibri"/>
+                <w:b w:val="0"/>
+                <w:i w:val="0"/>
+                <w:color w:val="212B36"/>
+                <w:sz w:val="19"/>
+              </w:rPr>
+              <w:t>sist. Contratos, visão/OCR</w:t>
+            </w:r>
+          </w:p>
+        </w:tc>
+      </w:tr>
+      <w:tr>
+        <w:tc>
+          <w:tcPr>
+            <w:tcW w:type="dxa" w:w="2736"/>
+            <w:tcMar>
+              <w:top w:w="80" w:type="dxa"/>
+              <w:bottom w:w="80" w:type="dxa"/>
+              <w:start w:w="120" w:type="dxa"/>
+              <w:end w:w="120" w:type="dxa"/>
+            </w:tcMar>
+            <w:shd w:val="clear" w:fill="F2F5F8"/>
+          </w:tcPr>
+          <w:p>
+            <w:pPr>
+              <w:spacing w:after="0"/>
+            </w:pPr>
+            <w:r>
+              <w:rPr>
+                <w:rFonts w:ascii="Calibri" w:hAnsi="Calibri"/>
+                <w:b/>
+                <w:i w:val="0"/>
+                <w:color w:val="0F2740"/>
+                <w:sz w:val="19"/>
+              </w:rPr>
+              <w:t>Suporte / IT Helpdesk</w:t>
+            </w:r>
+          </w:p>
+        </w:tc>
+        <w:tc>
+          <w:tcPr>
+            <w:tcW w:type="dxa" w:w="4752"/>
+            <w:tcMar>
+              <w:top w:w="80" w:type="dxa"/>
+              <w:bottom w:w="80" w:type="dxa"/>
+              <w:start w:w="120" w:type="dxa"/>
+              <w:end w:w="120" w:type="dxa"/>
+            </w:tcMar>
+            <w:shd w:val="clear" w:fill="F2F5F8"/>
+          </w:tcPr>
+          <w:p>
+            <w:pPr>
+              <w:spacing w:after="0"/>
+            </w:pPr>
+            <w:r>
+              <w:rPr>
+                <w:rFonts w:ascii="Calibri" w:hAnsi="Calibri"/>
+                <w:b w:val="0"/>
+                <w:i w:val="0"/>
+                <w:color w:val="212B36"/>
+                <w:sz w:val="19"/>
+              </w:rPr>
               <w:t>Abre e resolve chamados, executa runbooks, opera máquinas.</w:t>
             </w:r>
           </w:p>
@@ -1751,7 +1834,7 @@
               <w:start w:w="120" w:type="dxa"/>
               <w:end w:w="120" w:type="dxa"/>
             </w:tcMar>
-            <w:shd w:val="clear" w:fill="FFFFFF"/>
+            <w:shd w:val="clear" w:fill="F2F5F8"/>
           </w:tcPr>
           <w:p>
             <w:pPr>
@@ -1780,7 +1863,7 @@
               <w:start w:w="120" w:type="dxa"/>
               <w:end w:w="120" w:type="dxa"/>
             </w:tcMar>
-            <w:shd w:val="clear" w:fill="F2F5F8"/>
+            <w:shd w:val="clear" w:fill="FFFFFF"/>
           </w:tcPr>
           <w:p>
             <w:pPr>
@@ -1807,7 +1890,7 @@
               <w:start w:w="120" w:type="dxa"/>
               <w:end w:w="120" w:type="dxa"/>
             </w:tcMar>
-            <w:shd w:val="clear" w:fill="F2F5F8"/>
+            <w:shd w:val="clear" w:fill="FFFFFF"/>
           </w:tcPr>
           <w:p>
             <w:pPr>
@@ -1821,7 +1904,7 @@
                 <w:color w:val="212B36"/>
                 <w:sz w:val="19"/>
               </w:rPr>
-              <w:t>Revisa PRs, corrige CI, automatiza deploys.</w:t>
+              <w:t>Revisa PRs, corrige CI, evolui os sistemas internos.</w:t>
             </w:r>
           </w:p>
         </w:tc>
@@ -1834,7 +1917,7 @@
               <w:start w:w="120" w:type="dxa"/>
               <w:end w:w="120" w:type="dxa"/>
             </w:tcMar>
-            <w:shd w:val="clear" w:fill="F2F5F8"/>
+            <w:shd w:val="clear" w:fill="FFFFFF"/>
           </w:tcPr>
           <w:p>
             <w:pPr>
@@ -1863,7 +1946,7 @@
               <w:start w:w="120" w:type="dxa"/>
               <w:end w:w="120" w:type="dxa"/>
             </w:tcMar>
-            <w:shd w:val="clear" w:fill="FFFFFF"/>
+            <w:shd w:val="clear" w:fill="F2F5F8"/>
           </w:tcPr>
           <w:p>
             <w:pPr>
@@ -1890,7 +1973,7 @@
               <w:start w:w="120" w:type="dxa"/>
               <w:end w:w="120" w:type="dxa"/>
             </w:tcMar>
-            <w:shd w:val="clear" w:fill="FFFFFF"/>
+            <w:shd w:val="clear" w:fill="F2F5F8"/>
           </w:tcPr>
           <w:p>
             <w:pPr>
@@ -1917,7 +2000,7 @@
               <w:start w:w="120" w:type="dxa"/>
               <w:end w:w="120" w:type="dxa"/>
             </w:tcMar>
-            <w:shd w:val="clear" w:fill="FFFFFF"/>
+            <w:shd w:val="clear" w:fill="F2F5F8"/>
           </w:tcPr>
           <w:p>
             <w:pPr>
@@ -1931,7 +2014,7 @@
                 <w:color w:val="212B36"/>
                 <w:sz w:val="19"/>
               </w:rPr>
-              <w:t>Drive, ERP</w:t>
+              <w:t>sist. Contratos, ERP</w:t>
             </w:r>
           </w:p>
         </w:tc>
@@ -1958,6 +2041,533 @@
           <w:sz w:val="30"/>
         </w:rPr>
         <w:t xml:space="preserve">5  </w:t>
+      </w:r>
+      <w:r>
+        <w:rPr>
+          <w:rFonts w:ascii="Calibri" w:hAnsi="Calibri"/>
+          <w:b/>
+          <w:i w:val="0"/>
+          <w:color w:val="0F2740"/>
+          <w:sz w:val="30"/>
+        </w:rPr>
+        <w:t>Sistemas internos existentes — integrar e fortalecer</w:t>
+      </w:r>
+    </w:p>
+    <w:p>
+      <w:pPr>
+        <w:spacing w:after="120"/>
+      </w:pPr>
+      <w:r>
+        <w:rPr>
+          <w:rFonts w:ascii="Calibri" w:hAnsi="Calibri"/>
+          <w:b w:val="0"/>
+          <w:i w:val="0"/>
+          <w:color w:val="212B36"/>
+          <w:sz w:val="22"/>
+        </w:rPr>
+        <w:t>A setup.com.br já desenvolveu, de forma ágil (“vibe coding”), sistemas internos que sustentam a operação: gestão de projetos, gestão de contratos e a área comercial. A nova infraestrutura não os substitui — ela os encapsula como conectores e os coloca no alcance dos agentes.</w:t>
+      </w:r>
+    </w:p>
+    <w:p>
+      <w:pPr>
+        <w:spacing w:before="160" w:after="40"/>
+      </w:pPr>
+      <w:r>
+        <w:rPr>
+          <w:rFonts w:ascii="Calibri" w:hAnsi="Calibri"/>
+          <w:b/>
+          <w:i w:val="0"/>
+          <w:color w:val="1F6FEB"/>
+          <w:sz w:val="24"/>
+        </w:rPr>
+        <w:t>Integrar — esses sistemas viram conectores dos agentes</w:t>
+      </w:r>
+    </w:p>
+    <w:p>
+      <w:pPr>
+        <w:pStyle w:val="ListBullet"/>
+        <w:spacing w:after="60"/>
+      </w:pPr>
+      <w:r>
+        <w:rPr>
+          <w:rFonts w:ascii="Calibri" w:hAnsi="Calibri"/>
+          <w:b/>
+          <w:i w:val="0"/>
+          <w:color w:val="0F2740"/>
+          <w:sz w:val="22"/>
+        </w:rPr>
+        <w:t xml:space="preserve">Gestão de Projetos — </w:t>
+      </w:r>
+      <w:r>
+        <w:rPr>
+          <w:rFonts w:ascii="Calibri" w:hAnsi="Calibri"/>
+          <w:b w:val="0"/>
+          <w:i w:val="0"/>
+          <w:color w:val="212B36"/>
+          <w:sz w:val="22"/>
+        </w:rPr>
+        <w:t>o agente de PMO lê e atualiza status, monta relatórios e antecipa riscos.</w:t>
+      </w:r>
+    </w:p>
+    <w:p>
+      <w:pPr>
+        <w:pStyle w:val="ListBullet"/>
+        <w:spacing w:after="60"/>
+      </w:pPr>
+      <w:r>
+        <w:rPr>
+          <w:rFonts w:ascii="Calibri" w:hAnsi="Calibri"/>
+          <w:b/>
+          <w:i w:val="0"/>
+          <w:color w:val="0F2740"/>
+          <w:sz w:val="22"/>
+        </w:rPr>
+        <w:t xml:space="preserve">Gestão de Contratos — </w:t>
+      </w:r>
+      <w:r>
+        <w:rPr>
+          <w:rFonts w:ascii="Calibri" w:hAnsi="Calibri"/>
+          <w:b w:val="0"/>
+          <w:i w:val="0"/>
+          <w:color w:val="212B36"/>
+          <w:sz w:val="22"/>
+        </w:rPr>
+        <w:t>o agente de Contratos gera minutas, acompanha prazos e aciona renovações.</w:t>
+      </w:r>
+    </w:p>
+    <w:p>
+      <w:pPr>
+        <w:pStyle w:val="ListBullet"/>
+        <w:spacing w:after="60"/>
+      </w:pPr>
+      <w:r>
+        <w:rPr>
+          <w:rFonts w:ascii="Calibri" w:hAnsi="Calibri"/>
+          <w:b/>
+          <w:i w:val="0"/>
+          <w:color w:val="0F2740"/>
+          <w:sz w:val="22"/>
+        </w:rPr>
+        <w:t xml:space="preserve">Comercial — </w:t>
+      </w:r>
+      <w:r>
+        <w:rPr>
+          <w:rFonts w:ascii="Calibri" w:hAnsi="Calibri"/>
+          <w:b w:val="0"/>
+          <w:i w:val="0"/>
+          <w:color w:val="212B36"/>
+          <w:sz w:val="22"/>
+        </w:rPr>
+        <w:t>o agente de Atendimento/SDR qualifica leads e move o funil no próprio sistema comercial.</w:t>
+      </w:r>
+    </w:p>
+    <w:p>
+      <w:pPr>
+        <w:spacing w:before="160" w:after="40"/>
+      </w:pPr>
+      <w:r>
+        <w:rPr>
+          <w:rFonts w:ascii="Calibri" w:hAnsi="Calibri"/>
+          <w:b/>
+          <w:i w:val="0"/>
+          <w:color w:val="1F6FEB"/>
+          <w:sz w:val="24"/>
+        </w:rPr>
+        <w:t>Fortalecer — a IA também cuida da saúde desses sistemas</w:t>
+      </w:r>
+    </w:p>
+    <w:p>
+      <w:pPr>
+        <w:spacing w:after="120"/>
+      </w:pPr>
+      <w:r>
+        <w:rPr>
+          <w:rFonts w:ascii="Calibri" w:hAnsi="Calibri"/>
+          <w:b w:val="0"/>
+          <w:i w:val="0"/>
+          <w:color w:val="212B36"/>
+          <w:sz w:val="22"/>
+        </w:rPr>
+        <w:t>Sistemas nascidos em vibe coding entregam valor rápido, mas tendem a acumular dívida técnica. O agente de DevOps ajuda a estabilizá-los — adicionando testes, revisando alterações e documentando — reduzindo retrabalho e tornando-os mais confiáveis ao longo do tempo. O investimento feito é preservado e ampliado, não descartado.</w:t>
+      </w:r>
+    </w:p>
+    <w:p>
+      <w:pPr>
+        <w:spacing w:before="320" w:after="120"/>
+        <w:pBdr>
+          <w:bottom w:val="single" w:sz="6" w:space="4" w:color="D8E2EC"/>
+        </w:pBdr>
+      </w:pPr>
+      <w:r>
+        <w:rPr>
+          <w:rFonts w:ascii="Calibri" w:hAnsi="Calibri"/>
+          <w:b/>
+          <w:i w:val="0"/>
+          <w:color w:val="0FB5AE"/>
+          <w:sz w:val="30"/>
+        </w:rPr>
+        <w:t xml:space="preserve">6  </w:t>
+      </w:r>
+      <w:r>
+        <w:rPr>
+          <w:rFonts w:ascii="Calibri" w:hAnsi="Calibri"/>
+          <w:b/>
+          <w:i w:val="0"/>
+          <w:color w:val="0F2740"/>
+          <w:sz w:val="30"/>
+        </w:rPr>
+        <w:t>Pessoas no centro — clima, segurança psicológica e condições de trabalho</w:t>
+      </w:r>
+    </w:p>
+    <w:p>
+      <w:pPr>
+        <w:spacing w:after="120"/>
+      </w:pPr>
+      <w:r>
+        <w:rPr>
+          <w:rFonts w:ascii="Calibri" w:hAnsi="Calibri"/>
+          <w:b w:val="0"/>
+          <w:i w:val="0"/>
+          <w:color w:val="212B36"/>
+          <w:sz w:val="22"/>
+        </w:rPr>
+        <w:t>Tecnologia só compensa se melhora a vida de quem trabalha. O maior efeito desta infraestrutura não é a automação em si, mas o que ela faz pelas pessoas: tira de cima delas o trabalho repetitivo e penoso e devolve tempo, energia e tranquilidade.</w:t>
+      </w:r>
+    </w:p>
+    <w:p>
+      <w:pPr>
+        <w:spacing w:before="120" w:after="40"/>
+        <w:jc w:val="center"/>
+      </w:pPr>
+      <w:r>
+        <w:drawing>
+          <wp:inline xmlns:a="http://schemas.openxmlformats.org/drawingml/2006/main" xmlns:pic="http://schemas.openxmlformats.org/drawingml/2006/picture">
+            <wp:extent cx="6035040" cy="3386395"/>
+            <wp:docPr id="5" name="Picture 5"/>
+            <wp:cNvGraphicFramePr>
+              <a:graphicFrameLocks noChangeAspect="1"/>
+            </wp:cNvGraphicFramePr>
+            <a:graphic>
+              <a:graphicData uri="http://schemas.openxmlformats.org/drawingml/2006/picture">
+                <pic:pic>
+                  <pic:nvPicPr>
+                    <pic:cNvPr id="0" name="06_pessoas.png"/>
+                    <pic:cNvPicPr/>
+                  </pic:nvPicPr>
+                  <pic:blipFill>
+                    <a:blip r:embed="rId13"/>
+                    <a:stretch>
+                      <a:fillRect/>
+                    </a:stretch>
+                  </pic:blipFill>
+                  <pic:spPr>
+                    <a:xfrm>
+                      <a:off x="0" y="0"/>
+                      <a:ext cx="6035040" cy="3386395"/>
+                    </a:xfrm>
+                    <a:prstGeom prst="rect"/>
+                  </pic:spPr>
+                </pic:pic>
+              </a:graphicData>
+            </a:graphic>
+          </wp:inline>
+        </w:drawing>
+      </w:r>
+    </w:p>
+    <w:p>
+      <w:pPr>
+        <w:spacing w:after="200"/>
+        <w:jc w:val="center"/>
+      </w:pPr>
+      <w:r>
+        <w:rPr>
+          <w:rFonts w:ascii="Calibri" w:hAnsi="Calibri"/>
+          <w:b w:val="0"/>
+          <w:i/>
+          <w:color w:val="5B6B7B"/>
+          <w:sz w:val="18"/>
+        </w:rPr>
+        <w:t>Figura 4 — Como a infraestrutura melhora as condições de trabalho.</w:t>
+      </w:r>
+    </w:p>
+    <w:p>
+      <w:pPr>
+        <w:spacing w:before="160" w:after="40"/>
+      </w:pPr>
+      <w:r>
+        <w:rPr>
+          <w:rFonts w:ascii="Calibri" w:hAnsi="Calibri"/>
+          <w:b/>
+          <w:i w:val="0"/>
+          <w:color w:val="1F6FEB"/>
+          <w:sz w:val="24"/>
+        </w:rPr>
+        <w:t>Melhores condições de trabalho</w:t>
+      </w:r>
+    </w:p>
+    <w:p>
+      <w:pPr>
+        <w:pStyle w:val="ListBullet"/>
+        <w:spacing w:after="60"/>
+      </w:pPr>
+      <w:r>
+        <w:rPr>
+          <w:rFonts w:ascii="Calibri" w:hAnsi="Calibri"/>
+          <w:b/>
+          <w:i w:val="0"/>
+          <w:color w:val="0F2740"/>
+          <w:sz w:val="22"/>
+        </w:rPr>
+        <w:t xml:space="preserve">Menos trabalho braçal — </w:t>
+      </w:r>
+      <w:r>
+        <w:rPr>
+          <w:rFonts w:ascii="Calibri" w:hAnsi="Calibri"/>
+          <w:b w:val="0"/>
+          <w:i w:val="0"/>
+          <w:color w:val="212B36"/>
+          <w:sz w:val="22"/>
+        </w:rPr>
+        <w:t>a IA assume triagem de e-mail, atualização de status e montagem de documentos, reduzindo sobrecarga e horas extras.</w:t>
+      </w:r>
+    </w:p>
+    <w:p>
+      <w:pPr>
+        <w:pStyle w:val="ListBullet"/>
+        <w:spacing w:after="60"/>
+      </w:pPr>
+      <w:r>
+        <w:rPr>
+          <w:rFonts w:ascii="Calibri" w:hAnsi="Calibri"/>
+          <w:b/>
+          <w:i w:val="0"/>
+          <w:color w:val="0F2740"/>
+          <w:sz w:val="22"/>
+        </w:rPr>
+        <w:t xml:space="preserve">Flexibilidade — </w:t>
+      </w:r>
+      <w:r>
+        <w:rPr>
+          <w:rFonts w:ascii="Calibri" w:hAnsi="Calibri"/>
+          <w:b w:val="0"/>
+          <w:i w:val="0"/>
+          <w:color w:val="212B36"/>
+          <w:sz w:val="22"/>
+        </w:rPr>
+        <w:t>o mesmo assistente no WhatsApp e no celular reduz a fricção e apoia o equilíbrio entre vida e trabalho.</w:t>
+      </w:r>
+    </w:p>
+    <w:p>
+      <w:pPr>
+        <w:pStyle w:val="ListBullet"/>
+        <w:spacing w:after="60"/>
+      </w:pPr>
+      <w:r>
+        <w:rPr>
+          <w:rFonts w:ascii="Calibri" w:hAnsi="Calibri"/>
+          <w:b/>
+          <w:i w:val="0"/>
+          <w:color w:val="0F2740"/>
+          <w:sz w:val="22"/>
+        </w:rPr>
+        <w:t xml:space="preserve">Apoio constante — </w:t>
+      </w:r>
+      <w:r>
+        <w:rPr>
+          <w:rFonts w:ascii="Calibri" w:hAnsi="Calibri"/>
+          <w:b w:val="0"/>
+          <w:i w:val="0"/>
+          <w:color w:val="212B36"/>
+          <w:sz w:val="22"/>
+        </w:rPr>
+        <w:t>um mentor sempre disponível nivela o jogo: profissionais novos ou juniores entregam com mais confiança.</w:t>
+      </w:r>
+    </w:p>
+    <w:p>
+      <w:pPr>
+        <w:spacing w:before="160" w:after="40"/>
+      </w:pPr>
+      <w:r>
+        <w:rPr>
+          <w:rFonts w:ascii="Calibri" w:hAnsi="Calibri"/>
+          <w:b/>
+          <w:i w:val="0"/>
+          <w:color w:val="1F6FEB"/>
+          <w:sz w:val="24"/>
+        </w:rPr>
+        <w:t>Mais segurança psicológica</w:t>
+      </w:r>
+    </w:p>
+    <w:p>
+      <w:pPr>
+        <w:spacing w:after="120"/>
+      </w:pPr>
+      <w:r>
+        <w:rPr>
+          <w:rFonts w:ascii="Calibri" w:hAnsi="Calibri"/>
+          <w:b w:val="0"/>
+          <w:i w:val="0"/>
+          <w:color w:val="212B36"/>
+          <w:sz w:val="22"/>
+        </w:rPr>
+        <w:t>Segurança psicológica é o ambiente em que as pessoas se sentem seguras para propor ideias, pedir ajuda e errar sem medo de exposição. A infraestrutura reforça isso de forma concreta:</w:t>
+      </w:r>
+    </w:p>
+    <w:p>
+      <w:pPr>
+        <w:pStyle w:val="ListBullet"/>
+        <w:spacing w:after="60"/>
+      </w:pPr>
+      <w:r>
+        <w:rPr>
+          <w:rFonts w:ascii="Calibri" w:hAnsi="Calibri"/>
+          <w:b/>
+          <w:i w:val="0"/>
+          <w:color w:val="0F2740"/>
+          <w:sz w:val="22"/>
+        </w:rPr>
+        <w:t xml:space="preserve">Tirar dúvidas sem julgamento — </w:t>
+      </w:r>
+      <w:r>
+        <w:rPr>
+          <w:rFonts w:ascii="Calibri" w:hAnsi="Calibri"/>
+          <w:b w:val="0"/>
+          <w:i w:val="0"/>
+          <w:color w:val="212B36"/>
+          <w:sz w:val="22"/>
+        </w:rPr>
+        <w:t>dá para perguntar à IA quantas vezes for preciso, sem constrangimento de “perguntar besteira”.</w:t>
+      </w:r>
+    </w:p>
+    <w:p>
+      <w:pPr>
+        <w:pStyle w:val="ListBullet"/>
+        <w:spacing w:after="60"/>
+      </w:pPr>
+      <w:r>
+        <w:rPr>
+          <w:rFonts w:ascii="Calibri" w:hAnsi="Calibri"/>
+          <w:b/>
+          <w:i w:val="0"/>
+          <w:color w:val="0F2740"/>
+          <w:sz w:val="22"/>
+        </w:rPr>
+        <w:t xml:space="preserve">O erro fica no rascunho — </w:t>
+      </w:r>
+      <w:r>
+        <w:rPr>
+          <w:rFonts w:ascii="Calibri" w:hAnsi="Calibri"/>
+          <w:b w:val="0"/>
+          <w:i w:val="0"/>
+          <w:color w:val="212B36"/>
+          <w:sz w:val="22"/>
+        </w:rPr>
+        <w:t>como tudo passa por rascunho revisável e aprovação humana, o custo de errar cai — erra-se no rascunho, não na frente do cliente.</w:t>
+      </w:r>
+    </w:p>
+    <w:p>
+      <w:pPr>
+        <w:pStyle w:val="ListBullet"/>
+        <w:spacing w:after="60"/>
+      </w:pPr>
+      <w:r>
+        <w:rPr>
+          <w:rFonts w:ascii="Calibri" w:hAnsi="Calibri"/>
+          <w:b/>
+          <w:i w:val="0"/>
+          <w:color w:val="0F2740"/>
+          <w:sz w:val="22"/>
+        </w:rPr>
+        <w:t xml:space="preserve">Aumenta, não vigia — </w:t>
+      </w:r>
+      <w:r>
+        <w:rPr>
+          <w:rFonts w:ascii="Calibri" w:hAnsi="Calibri"/>
+          <w:b w:val="0"/>
+          <w:i w:val="0"/>
+          <w:color w:val="212B36"/>
+          <w:sz w:val="22"/>
+        </w:rPr>
+        <w:t>a IA aumenta as pessoas; ela não as vigia nem mede desempenho individual. O controle das decisões é sempre humano.</w:t>
+      </w:r>
+    </w:p>
+    <w:tbl>
+      <w:tblPr>
+        <w:tblW w:type="auto" w:w="0"/>
+        <w:tblLook w:firstColumn="1" w:firstRow="1" w:lastColumn="0" w:lastRow="0" w:noHBand="0" w:noVBand="1" w:val="04A0"/>
+        <w:tblBorders>
+          <w:top w:val="none"/>
+          <w:left w:val="none"/>
+          <w:bottom w:val="none"/>
+          <w:right w:val="none"/>
+          <w:insideH w:val="none"/>
+          <w:insideV w:val="none"/>
+        </w:tblBorders>
+      </w:tblPr>
+      <w:tblGrid>
+        <w:gridCol w:w="9648"/>
+      </w:tblGrid>
+      <w:tr>
+        <w:tc>
+          <w:tcPr>
+            <w:tcW w:type="dxa" w:w="9648"/>
+            <w:shd w:val="clear" w:fill="E6F7F6"/>
+            <w:tcMar>
+              <w:top w:w="140" w:type="dxa"/>
+              <w:bottom w:w="140" w:type="dxa"/>
+              <w:start w:w="200" w:type="dxa"/>
+              <w:end w:w="200" w:type="dxa"/>
+            </w:tcMar>
+          </w:tcPr>
+          <w:p>
+            <w:pPr>
+              <w:spacing w:after="0"/>
+            </w:pPr>
+            <w:r>
+              <w:rPr>
+                <w:rFonts w:ascii="Calibri" w:hAnsi="Calibri"/>
+                <w:b/>
+                <w:i w:val="0"/>
+                <w:color w:val="0F2740"/>
+                <w:sz w:val="22"/>
+              </w:rPr>
+              <w:t xml:space="preserve">Efeito no clima:  </w:t>
+            </w:r>
+            <w:r>
+              <w:rPr>
+                <w:rFonts w:ascii="Calibri" w:hAnsi="Calibri"/>
+                <w:b w:val="0"/>
+                <w:i w:val="0"/>
+                <w:color w:val="212B36"/>
+                <w:sz w:val="22"/>
+              </w:rPr>
+              <w:t>equipes menos sobrecarregadas e mais confiantes colaboram melhor, retêm talentos e atendem clientes com mais qualidade. A IA passa a ser vista como aliada do profissional — não como ameaça ao seu trabalho.</w:t>
+            </w:r>
+          </w:p>
+        </w:tc>
+      </w:tr>
+    </w:tbl>
+    <w:p>
+      <w:r>
+        <w:br w:type="page"/>
+      </w:r>
+    </w:p>
+    <w:p>
+      <w:pPr>
+        <w:spacing w:before="320" w:after="120"/>
+        <w:pBdr>
+          <w:bottom w:val="single" w:sz="6" w:space="4" w:color="D8E2EC"/>
+        </w:pBdr>
+      </w:pPr>
+      <w:r>
+        <w:rPr>
+          <w:rFonts w:ascii="Calibri" w:hAnsi="Calibri"/>
+          <w:b/>
+          <w:i w:val="0"/>
+          <w:color w:val="0FB5AE"/>
+          <w:sz w:val="30"/>
+        </w:rPr>
+        <w:t xml:space="preserve">7  </w:t>
       </w:r>
       <w:r>
         <w:rPr>
@@ -2156,7 +2766,7 @@
           <w:color w:val="0FB5AE"/>
           <w:sz w:val="30"/>
         </w:rPr>
-        <w:t xml:space="preserve">6  </w:t>
+        <w:t xml:space="preserve">8  </w:t>
       </w:r>
       <w:r>
         <w:rPr>
@@ -2181,7 +2791,7 @@
           <w:color w:val="212B36"/>
           <w:sz w:val="22"/>
         </w:rPr>
-        <w:t>Boa parte da camada de ferramentas já está implementada no ambiente atual da setup.com.br, o que reduz o tempo de implantação:</w:t>
+        <w:t>Boa parte da fundação já está no ambiente atual da setup.com.br, o que reduz o tempo e o risco de implantação:</w:t>
       </w:r>
     </w:p>
     <w:p>
@@ -2264,6 +2874,32 @@
           <w:color w:val="0F2740"/>
           <w:sz w:val="22"/>
         </w:rPr>
+        <w:t xml:space="preserve">Sistemas internos — </w:t>
+      </w:r>
+      <w:r>
+        <w:rPr>
+          <w:rFonts w:ascii="Calibri" w:hAnsi="Calibri"/>
+          <w:b w:val="0"/>
+          <w:i w:val="0"/>
+          <w:color w:val="212B36"/>
+          <w:sz w:val="22"/>
+        </w:rPr>
+        <w:t>gestão de projetos, contratos e comercial, prontos para serem expostos como conectores.</w:t>
+      </w:r>
+    </w:p>
+    <w:p>
+      <w:pPr>
+        <w:pStyle w:val="ListBullet"/>
+        <w:spacing w:after="60"/>
+      </w:pPr>
+      <w:r>
+        <w:rPr>
+          <w:rFonts w:ascii="Calibri" w:hAnsi="Calibri"/>
+          <w:b/>
+          <w:i w:val="0"/>
+          <w:color w:val="0F2740"/>
+          <w:sz w:val="22"/>
+        </w:rPr>
         <w:t xml:space="preserve">computer-use e GitHub — </w:t>
       </w:r>
       <w:r>
@@ -2323,7 +2959,7 @@
           <w:color w:val="0FB5AE"/>
           <w:sz w:val="30"/>
         </w:rPr>
-        <w:t xml:space="preserve">7  </w:t>
+        <w:t xml:space="preserve">9  </w:t>
       </w:r>
       <w:r>
         <w:rPr>
@@ -2345,7 +2981,7 @@
         <w:drawing>
           <wp:inline xmlns:a="http://schemas.openxmlformats.org/drawingml/2006/main" xmlns:pic="http://schemas.openxmlformats.org/drawingml/2006/picture">
             <wp:extent cx="6035040" cy="2890530"/>
-            <wp:docPr id="5" name="Picture 5"/>
+            <wp:docPr id="6" name="Picture 6"/>
             <wp:cNvGraphicFramePr>
               <a:graphicFrameLocks noChangeAspect="1"/>
             </wp:cNvGraphicFramePr>
@@ -2357,7 +2993,7 @@
                     <pic:cNvPicPr/>
                   </pic:nvPicPr>
                   <pic:blipFill>
-                    <a:blip r:embed="rId13"/>
+                    <a:blip r:embed="rId14"/>
                     <a:stretch>
                       <a:fillRect/>
                     </a:stretch>
@@ -2389,7 +3025,7 @@
           <w:color w:val="5B6B7B"/>
           <w:sz w:val="18"/>
         </w:rPr>
-        <w:t>Figura 4 — Implantação faseada, do alicerce à otimização contínua.</w:t>
+        <w:t>Figura 5 — Implantação faseada, do alicerce à otimização contínua.</w:t>
       </w:r>
     </w:p>
     <w:p>
@@ -2412,7 +3048,7 @@
           <w:color w:val="0FB5AE"/>
           <w:sz w:val="30"/>
         </w:rPr>
-        <w:t xml:space="preserve">8  </w:t>
+        <w:t xml:space="preserve">10  </w:t>
       </w:r>
       <w:r>
         <w:rPr>
@@ -2422,7 +3058,7 @@
           <w:color w:val="0F2740"/>
           <w:sz w:val="30"/>
         </w:rPr>
-        <w:t>Impacto esperado e indicadores</w:t>
+        <w:t>Indicadores de acompanhamento</w:t>
       </w:r>
     </w:p>
     <w:p>
@@ -2437,7 +3073,7 @@
           <w:color w:val="212B36"/>
           <w:sz w:val="22"/>
         </w:rPr>
-        <w:t>O sucesso é medido por produtividade e qualidade, não por adoção de tecnologia. Principais indicadores acompanhados:</w:t>
+        <w:t>O sucesso é medido por produtividade, qualidade e — em pé de igualdade — pelo bem-estar das equipes. Em vez de prometer números, definimos o que acompanhar: a linha de base é medida na própria operação e as metas saem dela. Assim evitamos projeções artificiais e ganhamos comparações honestas (antes e depois) sobre dados reais da setup.com.br.</w:t>
       </w:r>
     </w:p>
     <w:p>
@@ -2448,8 +3084,8 @@
       <w:r>
         <w:drawing>
           <wp:inline xmlns:a="http://schemas.openxmlformats.org/drawingml/2006/main" xmlns:pic="http://schemas.openxmlformats.org/drawingml/2006/picture">
-            <wp:extent cx="5669280" cy="3432256"/>
-            <wp:docPr id="6" name="Picture 6"/>
+            <wp:extent cx="5852160" cy="3554555"/>
+            <wp:docPr id="7" name="Picture 7"/>
             <wp:cNvGraphicFramePr>
               <a:graphicFrameLocks noChangeAspect="1"/>
             </wp:cNvGraphicFramePr>
@@ -2457,11 +3093,11 @@
               <a:graphicData uri="http://schemas.openxmlformats.org/drawingml/2006/picture">
                 <pic:pic>
                   <pic:nvPicPr>
-                    <pic:cNvPr id="0" name="05_kpis.png"/>
+                    <pic:cNvPr id="0" name="05_indicadores.png"/>
                     <pic:cNvPicPr/>
                   </pic:nvPicPr>
                   <pic:blipFill>
-                    <a:blip r:embed="rId14"/>
+                    <a:blip r:embed="rId15"/>
                     <a:stretch>
                       <a:fillRect/>
                     </a:stretch>
@@ -2469,7 +3105,7 @@
                   <pic:spPr>
                     <a:xfrm>
                       <a:off x="0" y="0"/>
-                      <a:ext cx="5669280" cy="3432256"/>
+                      <a:ext cx="5852160" cy="3554555"/>
                     </a:xfrm>
                     <a:prstGeom prst="rect"/>
                   </pic:spPr>
@@ -2493,137 +3129,7 @@
           <w:color w:val="5B6B7B"/>
           <w:sz w:val="18"/>
         </w:rPr>
-        <w:t>Figura 5 — Metas de impacto frente à linha de base atual.</w:t>
-      </w:r>
-    </w:p>
-    <w:p>
-      <w:pPr>
-        <w:pStyle w:val="ListBullet"/>
-        <w:spacing w:after="60"/>
-      </w:pPr>
-      <w:r>
-        <w:rPr>
-          <w:rFonts w:ascii="Calibri" w:hAnsi="Calibri"/>
-          <w:b/>
-          <w:i w:val="0"/>
-          <w:color w:val="0F2740"/>
-          <w:sz w:val="22"/>
-        </w:rPr>
-        <w:t xml:space="preserve">Produtividade — </w:t>
-      </w:r>
-      <w:r>
-        <w:rPr>
-          <w:rFonts w:ascii="Calibri" w:hAnsi="Calibri"/>
-          <w:b w:val="0"/>
-          <w:i w:val="0"/>
-          <w:color w:val="212B36"/>
-          <w:sz w:val="22"/>
-        </w:rPr>
-        <w:t>tempo poupado por profissional/semana (e-mails triados, documentos gerados).</w:t>
-      </w:r>
-    </w:p>
-    <w:p>
-      <w:pPr>
-        <w:pStyle w:val="ListBullet"/>
-        <w:spacing w:after="60"/>
-      </w:pPr>
-      <w:r>
-        <w:rPr>
-          <w:rFonts w:ascii="Calibri" w:hAnsi="Calibri"/>
-          <w:b/>
-          <w:i w:val="0"/>
-          <w:color w:val="0F2740"/>
-          <w:sz w:val="22"/>
-        </w:rPr>
-        <w:t xml:space="preserve">Agilidade — </w:t>
-      </w:r>
-      <w:r>
-        <w:rPr>
-          <w:rFonts w:ascii="Calibri" w:hAnsi="Calibri"/>
-          <w:b w:val="0"/>
-          <w:i w:val="0"/>
-          <w:color w:val="212B36"/>
-          <w:sz w:val="22"/>
-        </w:rPr>
-        <w:t>tempo de primeira resposta no WhatsApp e no atendimento.</w:t>
-      </w:r>
-    </w:p>
-    <w:p>
-      <w:pPr>
-        <w:pStyle w:val="ListBullet"/>
-        <w:spacing w:after="60"/>
-      </w:pPr>
-      <w:r>
-        <w:rPr>
-          <w:rFonts w:ascii="Calibri" w:hAnsi="Calibri"/>
-          <w:b/>
-          <w:i w:val="0"/>
-          <w:color w:val="0F2740"/>
-          <w:sz w:val="22"/>
-        </w:rPr>
-        <w:t xml:space="preserve">Autonomia — </w:t>
-      </w:r>
-      <w:r>
-        <w:rPr>
-          <w:rFonts w:ascii="Calibri" w:hAnsi="Calibri"/>
-          <w:b w:val="0"/>
-          <w:i w:val="0"/>
-          <w:color w:val="212B36"/>
-          <w:sz w:val="22"/>
-        </w:rPr>
-        <w:t>taxa de tarefas concluídas pelo loop sem intervenção.</w:t>
-      </w:r>
-    </w:p>
-    <w:p>
-      <w:pPr>
-        <w:pStyle w:val="ListBullet"/>
-        <w:spacing w:after="60"/>
-      </w:pPr>
-      <w:r>
-        <w:rPr>
-          <w:rFonts w:ascii="Calibri" w:hAnsi="Calibri"/>
-          <w:b/>
-          <w:i w:val="0"/>
-          <w:color w:val="0F2740"/>
-          <w:sz w:val="22"/>
-        </w:rPr>
-        <w:t xml:space="preserve">Qualidade e custo — </w:t>
-      </w:r>
-      <w:r>
-        <w:rPr>
-          <w:rFonts w:ascii="Calibri" w:hAnsi="Calibri"/>
-          <w:b w:val="0"/>
-          <w:i w:val="0"/>
-          <w:color w:val="212B36"/>
-          <w:sz w:val="22"/>
-        </w:rPr>
-        <w:t>taxa de aprovação humana das ações sugeridas e custo por tarefa.</w:t>
-      </w:r>
-    </w:p>
-    <w:p>
-      <w:pPr>
-        <w:pStyle w:val="ListBullet"/>
-        <w:spacing w:after="60"/>
-      </w:pPr>
-      <w:r>
-        <w:rPr>
-          <w:rFonts w:ascii="Calibri" w:hAnsi="Calibri"/>
-          <w:b/>
-          <w:i w:val="0"/>
-          <w:color w:val="0F2740"/>
-          <w:sz w:val="22"/>
-        </w:rPr>
-        <w:t xml:space="preserve">Segurança — </w:t>
-      </w:r>
-      <w:r>
-        <w:rPr>
-          <w:rFonts w:ascii="Calibri" w:hAnsi="Calibri"/>
-          <w:b w:val="0"/>
-          <w:i w:val="0"/>
-          <w:color w:val="212B36"/>
-          <w:sz w:val="22"/>
-        </w:rPr>
-        <w:t>zero incidentes de vazamento de dados.</w:t>
+        <w:t>Figura 6 — Domínios de indicadores; valores definidos a partir da medição inicial.</w:t>
       </w:r>
     </w:p>
     <w:p>
@@ -2689,7 +3195,7 @@
       </w:tr>
     </w:tbl>
     <w:sectPr>
-      <w:footerReference w:type="default" r:id="rId15"/>
+      <w:footerReference w:type="default" r:id="rId16"/>
       <w:pgSz w:w="12240" w:h="15840"/>
       <w:pgMar w:top="1224" w:right="1296" w:bottom="1224" w:left="1296" w:header="720" w:footer="720" w:gutter="0"/>
       <w:cols w:space="720"/>

</xml_diff>

<commit_message>
docs: aplica identidade visual oficial setup.com.br (logo + paleta)
- Logo oficial (extraido da arte enviada) embutido na capa, rodape e
  fechamento do .docx e do .pptx; versao branca para fundos escuros.
- Paleta da marca extraida do logo: petroleo #003C54, azul #0E6E92,
  teal #1F97B4, aco #609CC0, cinza #A8A8A8 — aplicada a diagramas,
  faixas de titulo, tabelas e cards (substitui azul/ambar/verde genericos).
- Logo no topo do markdown-fonte.
</commit_message>
<xml_diff>
--- a/docs/Infraestrutura-IA-setup.com.br.docx
+++ b/docs/Infraestrutura-IA-setup.com.br.docx
@@ -55,7 +55,7 @@
           <w:rFonts w:ascii="Calibri" w:hAnsi="Calibri"/>
           <w:b/>
           <w:i w:val="0"/>
-          <w:color w:val="5B6B7B"/>
+          <w:color w:val="5E6A72"/>
           <w:sz w:val="26"/>
         </w:rPr>
         <w:t>Documento Executivo</w:t>
@@ -86,7 +86,7 @@
           <w:rFonts w:ascii="Calibri" w:hAnsi="Calibri"/>
           <w:b w:val="0"/>
           <w:i/>
-          <w:color w:val="5B6B7B"/>
+          <w:color w:val="5E6A72"/>
           <w:sz w:val="22"/>
         </w:rPr>
         <w:t>Integração PC · Notebook · Tablet · Smartphone · WhatsApp · Google Workspace</w:t>
@@ -120,7 +120,7 @@
         <w:tc>
           <w:tcPr>
             <w:tcW w:type="dxa" w:w="3168"/>
-            <w:shd w:val="clear" w:fill="EAF2FB"/>
+            <w:shd w:val="clear" w:fill="E4EEF4"/>
             <w:tcMar>
               <w:top w:w="80" w:type="dxa"/>
               <w:bottom w:w="80" w:type="dxa"/>
@@ -138,7 +138,7 @@
                 <w:rFonts w:ascii="Calibri" w:hAnsi="Calibri"/>
                 <w:b/>
                 <w:i w:val="0"/>
-                <w:color w:val="5B6B7B"/>
+                <w:color w:val="5E6A72"/>
                 <w:sz w:val="17"/>
               </w:rPr>
               <w:t>VERSÃO</w:t>
@@ -149,7 +149,7 @@
                 <w:rFonts w:ascii="Calibri" w:hAnsi="Calibri"/>
                 <w:b/>
                 <w:i w:val="0"/>
-                <w:color w:val="0F2740"/>
+                <w:color w:val="003C54"/>
                 <w:sz w:val="22"/>
               </w:rPr>
               <w:t>1.0</w:t>
@@ -159,7 +159,7 @@
         <w:tc>
           <w:tcPr>
             <w:tcW w:type="dxa" w:w="3168"/>
-            <w:shd w:val="clear" w:fill="EAF2FB"/>
+            <w:shd w:val="clear" w:fill="E4EEF4"/>
             <w:tcMar>
               <w:top w:w="80" w:type="dxa"/>
               <w:bottom w:w="80" w:type="dxa"/>
@@ -177,7 +177,7 @@
                 <w:rFonts w:ascii="Calibri" w:hAnsi="Calibri"/>
                 <w:b/>
                 <w:i w:val="0"/>
-                <w:color w:val="5B6B7B"/>
+                <w:color w:val="5E6A72"/>
                 <w:sz w:val="17"/>
               </w:rPr>
               <w:t>DATA</w:t>
@@ -188,7 +188,7 @@
                 <w:rFonts w:ascii="Calibri" w:hAnsi="Calibri"/>
                 <w:b/>
                 <w:i w:val="0"/>
-                <w:color w:val="0F2740"/>
+                <w:color w:val="003C54"/>
                 <w:sz w:val="22"/>
               </w:rPr>
               <w:t>Junho / 2026</w:t>
@@ -198,7 +198,7 @@
         <w:tc>
           <w:tcPr>
             <w:tcW w:type="dxa" w:w="3168"/>
-            <w:shd w:val="clear" w:fill="EAF2FB"/>
+            <w:shd w:val="clear" w:fill="E4EEF4"/>
             <w:tcMar>
               <w:top w:w="80" w:type="dxa"/>
               <w:bottom w:w="80" w:type="dxa"/>
@@ -216,7 +216,7 @@
                 <w:rFonts w:ascii="Calibri" w:hAnsi="Calibri"/>
                 <w:b/>
                 <w:i w:val="0"/>
-                <w:color w:val="5B6B7B"/>
+                <w:color w:val="5E6A72"/>
                 <w:sz w:val="17"/>
               </w:rPr>
               <w:t>CLASSIFICAÇÃO</w:t>
@@ -227,7 +227,7 @@
                 <w:rFonts w:ascii="Calibri" w:hAnsi="Calibri"/>
                 <w:b/>
                 <w:i w:val="0"/>
-                <w:color w:val="0F2740"/>
+                <w:color w:val="003C54"/>
                 <w:sz w:val="22"/>
               </w:rPr>
               <w:t>Uso interno</w:t>
@@ -245,7 +245,7 @@
       <w:pPr>
         <w:spacing w:before="320" w:after="120"/>
         <w:pBdr>
-          <w:bottom w:val="single" w:sz="6" w:space="4" w:color="D8E2EC"/>
+          <w:bottom w:val="single" w:sz="6" w:space="4" w:color="D2E2EC"/>
         </w:pBdr>
       </w:pPr>
       <w:r>
@@ -253,7 +253,7 @@
           <w:rFonts w:ascii="Calibri" w:hAnsi="Calibri"/>
           <w:b/>
           <w:i w:val="0"/>
-          <w:color w:val="0F2740"/>
+          <w:color w:val="003C54"/>
           <w:sz w:val="30"/>
         </w:rPr>
         <w:t>Sumário Executivo</w:t>
@@ -299,7 +299,7 @@
           <w:rFonts w:ascii="Calibri" w:hAnsi="Calibri"/>
           <w:b/>
           <w:i w:val="0"/>
-          <w:color w:val="0F2740"/>
+          <w:color w:val="003C54"/>
           <w:sz w:val="22"/>
         </w:rPr>
         <w:t xml:space="preserve">Multimodelo — </w:t>
@@ -325,7 +325,7 @@
           <w:rFonts w:ascii="Calibri" w:hAnsi="Calibri"/>
           <w:b/>
           <w:i w:val="0"/>
-          <w:color w:val="0F2740"/>
+          <w:color w:val="003C54"/>
           <w:sz w:val="22"/>
         </w:rPr>
         <w:t xml:space="preserve">Harness loop — </w:t>
@@ -351,7 +351,7 @@
           <w:rFonts w:ascii="Calibri" w:hAnsi="Calibri"/>
           <w:b/>
           <w:i w:val="0"/>
-          <w:color w:val="0F2740"/>
+          <w:color w:val="003C54"/>
           <w:sz w:val="22"/>
         </w:rPr>
         <w:t xml:space="preserve">Conectores MCP — </w:t>
@@ -387,7 +387,7 @@
         <w:tc>
           <w:tcPr>
             <w:tcW w:type="dxa" w:w="9648"/>
-            <w:shd w:val="clear" w:fill="E6F7F6"/>
+            <w:shd w:val="clear" w:fill="E1F0F4"/>
             <w:tcMar>
               <w:top w:w="140" w:type="dxa"/>
               <w:bottom w:w="140" w:type="dxa"/>
@@ -404,7 +404,7 @@
                 <w:rFonts w:ascii="Calibri" w:hAnsi="Calibri"/>
                 <w:b/>
                 <w:i w:val="0"/>
-                <w:color w:val="0F2740"/>
+                <w:color w:val="003C54"/>
                 <w:sz w:val="22"/>
               </w:rPr>
               <w:t xml:space="preserve">Resultado esperado:  </w:t>
@@ -473,7 +473,7 @@
           <w:rFonts w:ascii="Calibri" w:hAnsi="Calibri"/>
           <w:b w:val="0"/>
           <w:i/>
-          <w:color w:val="5B6B7B"/>
+          <w:color w:val="5E6A72"/>
           <w:sz w:val="18"/>
         </w:rPr>
         <w:t>Figura 1 — A infraestrutura em quatro camadas integradas.</w:t>
@@ -488,7 +488,7 @@
       <w:pPr>
         <w:spacing w:before="320" w:after="120"/>
         <w:pBdr>
-          <w:bottom w:val="single" w:sz="6" w:space="4" w:color="D8E2EC"/>
+          <w:bottom w:val="single" w:sz="6" w:space="4" w:color="D2E2EC"/>
         </w:pBdr>
       </w:pPr>
       <w:r>
@@ -496,7 +496,7 @@
           <w:rFonts w:ascii="Calibri" w:hAnsi="Calibri"/>
           <w:b/>
           <w:i w:val="0"/>
-          <w:color w:val="0FB5AE"/>
+          <w:color w:val="1F97B4"/>
           <w:sz w:val="30"/>
         </w:rPr>
         <w:t xml:space="preserve">1  </w:t>
@@ -506,7 +506,7 @@
           <w:rFonts w:ascii="Calibri" w:hAnsi="Calibri"/>
           <w:b/>
           <w:i w:val="0"/>
-          <w:color w:val="0F2740"/>
+          <w:color w:val="003C54"/>
           <w:sz w:val="30"/>
         </w:rPr>
         <w:t>Um assistente em cada tela</w:t>
@@ -555,7 +555,7 @@
               <w:start w:w="120" w:type="dxa"/>
               <w:end w:w="120" w:type="dxa"/>
             </w:tcMar>
-            <w:shd w:val="clear" w:fill="0F2740"/>
+            <w:shd w:val="clear" w:fill="003C54"/>
           </w:tcPr>
           <w:p>
             <w:pPr>
@@ -582,7 +582,7 @@
               <w:start w:w="120" w:type="dxa"/>
               <w:end w:w="120" w:type="dxa"/>
             </w:tcMar>
-            <w:shd w:val="clear" w:fill="0F2740"/>
+            <w:shd w:val="clear" w:fill="003C54"/>
           </w:tcPr>
           <w:p>
             <w:pPr>
@@ -611,7 +611,7 @@
               <w:start w:w="120" w:type="dxa"/>
               <w:end w:w="120" w:type="dxa"/>
             </w:tcMar>
-            <w:shd w:val="clear" w:fill="F2F5F8"/>
+            <w:shd w:val="clear" w:fill="F1F4F6"/>
           </w:tcPr>
           <w:p>
             <w:pPr>
@@ -622,7 +622,7 @@
                 <w:rFonts w:ascii="Calibri" w:hAnsi="Calibri"/>
                 <w:b/>
                 <w:i w:val="0"/>
-                <w:color w:val="1F6FEB"/>
+                <w:color w:val="0E6E92"/>
                 <w:sz w:val="21"/>
               </w:rPr>
               <w:t>PC / Notebook</w:t>
@@ -638,7 +638,7 @@
               <w:start w:w="120" w:type="dxa"/>
               <w:end w:w="120" w:type="dxa"/>
             </w:tcMar>
-            <w:shd w:val="clear" w:fill="F2F5F8"/>
+            <w:shd w:val="clear" w:fill="F1F4F6"/>
           </w:tcPr>
           <w:p>
             <w:pPr>
@@ -678,7 +678,7 @@
                 <w:rFonts w:ascii="Calibri" w:hAnsi="Calibri"/>
                 <w:b/>
                 <w:i w:val="0"/>
-                <w:color w:val="1F6FEB"/>
+                <w:color w:val="0E6E92"/>
                 <w:sz w:val="21"/>
               </w:rPr>
               <w:t>Tablet</w:t>
@@ -723,7 +723,7 @@
               <w:start w:w="120" w:type="dxa"/>
               <w:end w:w="120" w:type="dxa"/>
             </w:tcMar>
-            <w:shd w:val="clear" w:fill="F2F5F8"/>
+            <w:shd w:val="clear" w:fill="F1F4F6"/>
           </w:tcPr>
           <w:p>
             <w:pPr>
@@ -734,7 +734,7 @@
                 <w:rFonts w:ascii="Calibri" w:hAnsi="Calibri"/>
                 <w:b/>
                 <w:i w:val="0"/>
-                <w:color w:val="1F6FEB"/>
+                <w:color w:val="0E6E92"/>
                 <w:sz w:val="21"/>
               </w:rPr>
               <w:t>Smartphone</w:t>
@@ -750,7 +750,7 @@
               <w:start w:w="120" w:type="dxa"/>
               <w:end w:w="120" w:type="dxa"/>
             </w:tcMar>
-            <w:shd w:val="clear" w:fill="F2F5F8"/>
+            <w:shd w:val="clear" w:fill="F1F4F6"/>
           </w:tcPr>
           <w:p>
             <w:pPr>
@@ -790,7 +790,7 @@
                 <w:rFonts w:ascii="Calibri" w:hAnsi="Calibri"/>
                 <w:b/>
                 <w:i w:val="0"/>
-                <w:color w:val="1F6FEB"/>
+                <w:color w:val="0E6E92"/>
                 <w:sz w:val="21"/>
               </w:rPr>
               <w:t>WhatsApp</w:t>
@@ -835,7 +835,7 @@
               <w:start w:w="120" w:type="dxa"/>
               <w:end w:w="120" w:type="dxa"/>
             </w:tcMar>
-            <w:shd w:val="clear" w:fill="F2F5F8"/>
+            <w:shd w:val="clear" w:fill="F1F4F6"/>
           </w:tcPr>
           <w:p>
             <w:pPr>
@@ -846,7 +846,7 @@
                 <w:rFonts w:ascii="Calibri" w:hAnsi="Calibri"/>
                 <w:b/>
                 <w:i w:val="0"/>
-                <w:color w:val="1F6FEB"/>
+                <w:color w:val="0E6E92"/>
                 <w:sz w:val="21"/>
               </w:rPr>
               <w:t>Chat web / IDE</w:t>
@@ -862,7 +862,7 @@
               <w:start w:w="120" w:type="dxa"/>
               <w:end w:w="120" w:type="dxa"/>
             </w:tcMar>
-            <w:shd w:val="clear" w:fill="F2F5F8"/>
+            <w:shd w:val="clear" w:fill="F1F4F6"/>
           </w:tcPr>
           <w:p>
             <w:pPr>
@@ -915,7 +915,7 @@
       <w:pPr>
         <w:spacing w:before="320" w:after="120"/>
         <w:pBdr>
-          <w:bottom w:val="single" w:sz="6" w:space="4" w:color="D8E2EC"/>
+          <w:bottom w:val="single" w:sz="6" w:space="4" w:color="D2E2EC"/>
         </w:pBdr>
       </w:pPr>
       <w:r>
@@ -923,7 +923,7 @@
           <w:rFonts w:ascii="Calibri" w:hAnsi="Calibri"/>
           <w:b/>
           <w:i w:val="0"/>
-          <w:color w:val="0FB5AE"/>
+          <w:color w:val="1F97B4"/>
           <w:sz w:val="30"/>
         </w:rPr>
         <w:t xml:space="preserve">2  </w:t>
@@ -933,7 +933,7 @@
           <w:rFonts w:ascii="Calibri" w:hAnsi="Calibri"/>
           <w:b/>
           <w:i w:val="0"/>
-          <w:color w:val="0F2740"/>
+          <w:color w:val="003C54"/>
           <w:sz w:val="30"/>
         </w:rPr>
         <w:t>Multimodelo — a IA certa para cada tarefa</w:t>
@@ -1004,7 +1004,7 @@
           <w:rFonts w:ascii="Calibri" w:hAnsi="Calibri"/>
           <w:b w:val="0"/>
           <w:i/>
-          <w:color w:val="5B6B7B"/>
+          <w:color w:val="5E6A72"/>
           <w:sz w:val="18"/>
         </w:rPr>
         <w:t>Figura 2 — Roteamento por custo e capacidade.</w:t>
@@ -1034,7 +1034,7 @@
       <w:pPr>
         <w:spacing w:before="320" w:after="120"/>
         <w:pBdr>
-          <w:bottom w:val="single" w:sz="6" w:space="4" w:color="D8E2EC"/>
+          <w:bottom w:val="single" w:sz="6" w:space="4" w:color="D2E2EC"/>
         </w:pBdr>
       </w:pPr>
       <w:r>
@@ -1042,7 +1042,7 @@
           <w:rFonts w:ascii="Calibri" w:hAnsi="Calibri"/>
           <w:b/>
           <w:i w:val="0"/>
-          <w:color w:val="0FB5AE"/>
+          <w:color w:val="1F97B4"/>
           <w:sz w:val="30"/>
         </w:rPr>
         <w:t xml:space="preserve">3  </w:t>
@@ -1052,7 +1052,7 @@
           <w:rFonts w:ascii="Calibri" w:hAnsi="Calibri"/>
           <w:b/>
           <w:i w:val="0"/>
-          <w:color w:val="0F2740"/>
+          <w:color w:val="003C54"/>
           <w:sz w:val="30"/>
         </w:rPr>
         <w:t>Harness loop — de chatbot a agente que entrega</w:t>
@@ -1123,7 +1123,7 @@
           <w:rFonts w:ascii="Calibri" w:hAnsi="Calibri"/>
           <w:b w:val="0"/>
           <w:i/>
-          <w:color w:val="5B6B7B"/>
+          <w:color w:val="5E6A72"/>
           <w:sz w:val="18"/>
         </w:rPr>
         <w:t>Figura 3 — O ciclo planejar → agir → observar → refletir.</w:t>
@@ -1138,7 +1138,7 @@
           <w:rFonts w:ascii="Calibri" w:hAnsi="Calibri"/>
           <w:b/>
           <w:i w:val="0"/>
-          <w:color w:val="1F6FEB"/>
+          <w:color w:val="0E6E92"/>
           <w:sz w:val="24"/>
         </w:rPr>
         <w:t>Exemplo real — “Fechar proposta para o cliente X”</w:t>
@@ -1154,7 +1154,7 @@
           <w:rFonts w:ascii="Calibri" w:hAnsi="Calibri"/>
           <w:b/>
           <w:i w:val="0"/>
-          <w:color w:val="0F2740"/>
+          <w:color w:val="003C54"/>
           <w:sz w:val="22"/>
         </w:rPr>
         <w:t xml:space="preserve">Planejar — </w:t>
@@ -1180,7 +1180,7 @@
           <w:rFonts w:ascii="Calibri" w:hAnsi="Calibri"/>
           <w:b/>
           <w:i w:val="0"/>
-          <w:color w:val="0F2740"/>
+          <w:color w:val="003C54"/>
           <w:sz w:val="22"/>
         </w:rPr>
         <w:t xml:space="preserve">Agir / Observar (loop) — </w:t>
@@ -1206,7 +1206,7 @@
           <w:rFonts w:ascii="Calibri" w:hAnsi="Calibri"/>
           <w:b/>
           <w:i w:val="0"/>
-          <w:color w:val="0F2740"/>
+          <w:color w:val="003C54"/>
           <w:sz w:val="22"/>
         </w:rPr>
         <w:t xml:space="preserve">Aprovação humana — </w:t>
@@ -1257,7 +1257,7 @@
         <w:tc>
           <w:tcPr>
             <w:tcW w:type="dxa" w:w="9648"/>
-            <w:shd w:val="clear" w:fill="FDF3E0"/>
+            <w:shd w:val="clear" w:fill="E8F1F8"/>
             <w:tcMar>
               <w:top w:w="140" w:type="dxa"/>
               <w:bottom w:w="140" w:type="dxa"/>
@@ -1274,7 +1274,7 @@
                 <w:rFonts w:ascii="Calibri" w:hAnsi="Calibri"/>
                 <w:b/>
                 <w:i w:val="0"/>
-                <w:color w:val="0F2740"/>
+                <w:color w:val="003C54"/>
                 <w:sz w:val="22"/>
               </w:rPr>
               <w:t xml:space="preserve">Controle humano (human-in-the-loop):  </w:t>
@@ -1297,7 +1297,7 @@
       <w:pPr>
         <w:spacing w:before="320" w:after="120"/>
         <w:pBdr>
-          <w:bottom w:val="single" w:sz="6" w:space="4" w:color="D8E2EC"/>
+          <w:bottom w:val="single" w:sz="6" w:space="4" w:color="D2E2EC"/>
         </w:pBdr>
       </w:pPr>
       <w:r>
@@ -1305,7 +1305,7 @@
           <w:rFonts w:ascii="Calibri" w:hAnsi="Calibri"/>
           <w:b/>
           <w:i w:val="0"/>
-          <w:color w:val="0FB5AE"/>
+          <w:color w:val="1F97B4"/>
           <w:sz w:val="30"/>
         </w:rPr>
         <w:t xml:space="preserve">4  </w:t>
@@ -1315,7 +1315,7 @@
           <w:rFonts w:ascii="Calibri" w:hAnsi="Calibri"/>
           <w:b/>
           <w:i w:val="0"/>
-          <w:color w:val="0F2740"/>
+          <w:color w:val="003C54"/>
           <w:sz w:val="30"/>
         </w:rPr>
         <w:t>Catálogo de agentes especializados</w:t>
@@ -1365,7 +1365,7 @@
               <w:start w:w="120" w:type="dxa"/>
               <w:end w:w="120" w:type="dxa"/>
             </w:tcMar>
-            <w:shd w:val="clear" w:fill="1F6FEB"/>
+            <w:shd w:val="clear" w:fill="0E6E92"/>
           </w:tcPr>
           <w:p>
             <w:pPr>
@@ -1392,7 +1392,7 @@
               <w:start w:w="120" w:type="dxa"/>
               <w:end w:w="120" w:type="dxa"/>
             </w:tcMar>
-            <w:shd w:val="clear" w:fill="1F6FEB"/>
+            <w:shd w:val="clear" w:fill="0E6E92"/>
           </w:tcPr>
           <w:p>
             <w:pPr>
@@ -1419,7 +1419,7 @@
               <w:start w:w="120" w:type="dxa"/>
               <w:end w:w="120" w:type="dxa"/>
             </w:tcMar>
-            <w:shd w:val="clear" w:fill="1F6FEB"/>
+            <w:shd w:val="clear" w:fill="0E6E92"/>
           </w:tcPr>
           <w:p>
             <w:pPr>
@@ -1448,7 +1448,7 @@
               <w:start w:w="120" w:type="dxa"/>
               <w:end w:w="120" w:type="dxa"/>
             </w:tcMar>
-            <w:shd w:val="clear" w:fill="F2F5F8"/>
+            <w:shd w:val="clear" w:fill="F1F4F6"/>
           </w:tcPr>
           <w:p>
             <w:pPr>
@@ -1459,7 +1459,7 @@
                 <w:rFonts w:ascii="Calibri" w:hAnsi="Calibri"/>
                 <w:b/>
                 <w:i w:val="0"/>
-                <w:color w:val="0F2740"/>
+                <w:color w:val="003C54"/>
                 <w:sz w:val="19"/>
               </w:rPr>
               <w:t>Assistente Executivo</w:t>
@@ -1475,7 +1475,7 @@
               <w:start w:w="120" w:type="dxa"/>
               <w:end w:w="120" w:type="dxa"/>
             </w:tcMar>
-            <w:shd w:val="clear" w:fill="F2F5F8"/>
+            <w:shd w:val="clear" w:fill="F1F4F6"/>
           </w:tcPr>
           <w:p>
             <w:pPr>
@@ -1502,7 +1502,7 @@
               <w:start w:w="120" w:type="dxa"/>
               <w:end w:w="120" w:type="dxa"/>
             </w:tcMar>
-            <w:shd w:val="clear" w:fill="F2F5F8"/>
+            <w:shd w:val="clear" w:fill="F1F4F6"/>
           </w:tcPr>
           <w:p>
             <w:pPr>
@@ -1542,7 +1542,7 @@
                 <w:rFonts w:ascii="Calibri" w:hAnsi="Calibri"/>
                 <w:b/>
                 <w:i w:val="0"/>
-                <w:color w:val="0F2740"/>
+                <w:color w:val="003C54"/>
                 <w:sz w:val="19"/>
               </w:rPr>
               <w:t>Atendimento / SDR</w:t>
@@ -1614,7 +1614,7 @@
               <w:start w:w="120" w:type="dxa"/>
               <w:end w:w="120" w:type="dxa"/>
             </w:tcMar>
-            <w:shd w:val="clear" w:fill="F2F5F8"/>
+            <w:shd w:val="clear" w:fill="F1F4F6"/>
           </w:tcPr>
           <w:p>
             <w:pPr>
@@ -1625,7 +1625,7 @@
                 <w:rFonts w:ascii="Calibri" w:hAnsi="Calibri"/>
                 <w:b/>
                 <w:i w:val="0"/>
-                <w:color w:val="0F2740"/>
+                <w:color w:val="003C54"/>
                 <w:sz w:val="19"/>
               </w:rPr>
               <w:t>PMO / Projetos</w:t>
@@ -1641,7 +1641,7 @@
               <w:start w:w="120" w:type="dxa"/>
               <w:end w:w="120" w:type="dxa"/>
             </w:tcMar>
-            <w:shd w:val="clear" w:fill="F2F5F8"/>
+            <w:shd w:val="clear" w:fill="F1F4F6"/>
           </w:tcPr>
           <w:p>
             <w:pPr>
@@ -1668,7 +1668,7 @@
               <w:start w:w="120" w:type="dxa"/>
               <w:end w:w="120" w:type="dxa"/>
             </w:tcMar>
-            <w:shd w:val="clear" w:fill="F2F5F8"/>
+            <w:shd w:val="clear" w:fill="F1F4F6"/>
           </w:tcPr>
           <w:p>
             <w:pPr>
@@ -1708,7 +1708,7 @@
                 <w:rFonts w:ascii="Calibri" w:hAnsi="Calibri"/>
                 <w:b/>
                 <w:i w:val="0"/>
-                <w:color w:val="0F2740"/>
+                <w:color w:val="003C54"/>
                 <w:sz w:val="19"/>
               </w:rPr>
               <w:t>Contratos</w:t>
@@ -1780,7 +1780,7 @@
               <w:start w:w="120" w:type="dxa"/>
               <w:end w:w="120" w:type="dxa"/>
             </w:tcMar>
-            <w:shd w:val="clear" w:fill="F2F5F8"/>
+            <w:shd w:val="clear" w:fill="F1F4F6"/>
           </w:tcPr>
           <w:p>
             <w:pPr>
@@ -1791,7 +1791,7 @@
                 <w:rFonts w:ascii="Calibri" w:hAnsi="Calibri"/>
                 <w:b/>
                 <w:i w:val="0"/>
-                <w:color w:val="0F2740"/>
+                <w:color w:val="003C54"/>
                 <w:sz w:val="19"/>
               </w:rPr>
               <w:t>Suporte / IT Helpdesk</w:t>
@@ -1807,7 +1807,7 @@
               <w:start w:w="120" w:type="dxa"/>
               <w:end w:w="120" w:type="dxa"/>
             </w:tcMar>
-            <w:shd w:val="clear" w:fill="F2F5F8"/>
+            <w:shd w:val="clear" w:fill="F1F4F6"/>
           </w:tcPr>
           <w:p>
             <w:pPr>
@@ -1834,7 +1834,7 @@
               <w:start w:w="120" w:type="dxa"/>
               <w:end w:w="120" w:type="dxa"/>
             </w:tcMar>
-            <w:shd w:val="clear" w:fill="F2F5F8"/>
+            <w:shd w:val="clear" w:fill="F1F4F6"/>
           </w:tcPr>
           <w:p>
             <w:pPr>
@@ -1874,7 +1874,7 @@
                 <w:rFonts w:ascii="Calibri" w:hAnsi="Calibri"/>
                 <w:b/>
                 <w:i w:val="0"/>
-                <w:color w:val="0F2740"/>
+                <w:color w:val="003C54"/>
                 <w:sz w:val="19"/>
               </w:rPr>
               <w:t>DevOps / Engenharia</w:t>
@@ -1946,7 +1946,7 @@
               <w:start w:w="120" w:type="dxa"/>
               <w:end w:w="120" w:type="dxa"/>
             </w:tcMar>
-            <w:shd w:val="clear" w:fill="F2F5F8"/>
+            <w:shd w:val="clear" w:fill="F1F4F6"/>
           </w:tcPr>
           <w:p>
             <w:pPr>
@@ -1957,7 +1957,7 @@
                 <w:rFonts w:ascii="Calibri" w:hAnsi="Calibri"/>
                 <w:b/>
                 <w:i w:val="0"/>
-                <w:color w:val="0F2740"/>
+                <w:color w:val="003C54"/>
                 <w:sz w:val="19"/>
               </w:rPr>
               <w:t>Financeiro</w:t>
@@ -1973,7 +1973,7 @@
               <w:start w:w="120" w:type="dxa"/>
               <w:end w:w="120" w:type="dxa"/>
             </w:tcMar>
-            <w:shd w:val="clear" w:fill="F2F5F8"/>
+            <w:shd w:val="clear" w:fill="F1F4F6"/>
           </w:tcPr>
           <w:p>
             <w:pPr>
@@ -2000,7 +2000,7 @@
               <w:start w:w="120" w:type="dxa"/>
               <w:end w:w="120" w:type="dxa"/>
             </w:tcMar>
-            <w:shd w:val="clear" w:fill="F2F5F8"/>
+            <w:shd w:val="clear" w:fill="F1F4F6"/>
           </w:tcPr>
           <w:p>
             <w:pPr>
@@ -2029,7 +2029,7 @@
       <w:pPr>
         <w:spacing w:before="320" w:after="120"/>
         <w:pBdr>
-          <w:bottom w:val="single" w:sz="6" w:space="4" w:color="D8E2EC"/>
+          <w:bottom w:val="single" w:sz="6" w:space="4" w:color="D2E2EC"/>
         </w:pBdr>
       </w:pPr>
       <w:r>
@@ -2037,7 +2037,7 @@
           <w:rFonts w:ascii="Calibri" w:hAnsi="Calibri"/>
           <w:b/>
           <w:i w:val="0"/>
-          <w:color w:val="0FB5AE"/>
+          <w:color w:val="1F97B4"/>
           <w:sz w:val="30"/>
         </w:rPr>
         <w:t xml:space="preserve">5  </w:t>
@@ -2047,7 +2047,7 @@
           <w:rFonts w:ascii="Calibri" w:hAnsi="Calibri"/>
           <w:b/>
           <w:i w:val="0"/>
-          <w:color w:val="0F2740"/>
+          <w:color w:val="003C54"/>
           <w:sz w:val="30"/>
         </w:rPr>
         <w:t>Sistemas internos existentes — integrar e fortalecer</w:t>
@@ -2077,7 +2077,7 @@
           <w:rFonts w:ascii="Calibri" w:hAnsi="Calibri"/>
           <w:b/>
           <w:i w:val="0"/>
-          <w:color w:val="1F6FEB"/>
+          <w:color w:val="0E6E92"/>
           <w:sz w:val="24"/>
         </w:rPr>
         <w:t>Integrar — esses sistemas viram conectores dos agentes</w:t>
@@ -2093,7 +2093,7 @@
           <w:rFonts w:ascii="Calibri" w:hAnsi="Calibri"/>
           <w:b/>
           <w:i w:val="0"/>
-          <w:color w:val="0F2740"/>
+          <w:color w:val="003C54"/>
           <w:sz w:val="22"/>
         </w:rPr>
         <w:t xml:space="preserve">Gestão de Projetos — </w:t>
@@ -2119,7 +2119,7 @@
           <w:rFonts w:ascii="Calibri" w:hAnsi="Calibri"/>
           <w:b/>
           <w:i w:val="0"/>
-          <w:color w:val="0F2740"/>
+          <w:color w:val="003C54"/>
           <w:sz w:val="22"/>
         </w:rPr>
         <w:t xml:space="preserve">Gestão de Contratos — </w:t>
@@ -2145,7 +2145,7 @@
           <w:rFonts w:ascii="Calibri" w:hAnsi="Calibri"/>
           <w:b/>
           <w:i w:val="0"/>
-          <w:color w:val="0F2740"/>
+          <w:color w:val="003C54"/>
           <w:sz w:val="22"/>
         </w:rPr>
         <w:t xml:space="preserve">Comercial — </w:t>
@@ -2170,7 +2170,7 @@
           <w:rFonts w:ascii="Calibri" w:hAnsi="Calibri"/>
           <w:b/>
           <w:i w:val="0"/>
-          <w:color w:val="1F6FEB"/>
+          <w:color w:val="0E6E92"/>
           <w:sz w:val="24"/>
         </w:rPr>
         <w:t>Fortalecer — a IA também cuida da saúde desses sistemas</w:t>
@@ -2195,7 +2195,7 @@
       <w:pPr>
         <w:spacing w:before="320" w:after="120"/>
         <w:pBdr>
-          <w:bottom w:val="single" w:sz="6" w:space="4" w:color="D8E2EC"/>
+          <w:bottom w:val="single" w:sz="6" w:space="4" w:color="D2E2EC"/>
         </w:pBdr>
       </w:pPr>
       <w:r>
@@ -2203,7 +2203,7 @@
           <w:rFonts w:ascii="Calibri" w:hAnsi="Calibri"/>
           <w:b/>
           <w:i w:val="0"/>
-          <w:color w:val="0FB5AE"/>
+          <w:color w:val="1F97B4"/>
           <w:sz w:val="30"/>
         </w:rPr>
         <w:t xml:space="preserve">6  </w:t>
@@ -2213,7 +2213,7 @@
           <w:rFonts w:ascii="Calibri" w:hAnsi="Calibri"/>
           <w:b/>
           <w:i w:val="0"/>
-          <w:color w:val="0F2740"/>
+          <w:color w:val="003C54"/>
           <w:sz w:val="30"/>
         </w:rPr>
         <w:t>Pessoas no centro — clima, segurança psicológica e condições de trabalho</w:t>
@@ -2284,7 +2284,7 @@
           <w:rFonts w:ascii="Calibri" w:hAnsi="Calibri"/>
           <w:b w:val="0"/>
           <w:i/>
-          <w:color w:val="5B6B7B"/>
+          <w:color w:val="5E6A72"/>
           <w:sz w:val="18"/>
         </w:rPr>
         <w:t>Figura 4 — Como a infraestrutura melhora as condições de trabalho.</w:t>
@@ -2299,7 +2299,7 @@
           <w:rFonts w:ascii="Calibri" w:hAnsi="Calibri"/>
           <w:b/>
           <w:i w:val="0"/>
-          <w:color w:val="1F6FEB"/>
+          <w:color w:val="0E6E92"/>
           <w:sz w:val="24"/>
         </w:rPr>
         <w:t>Melhores condições de trabalho</w:t>
@@ -2315,7 +2315,7 @@
           <w:rFonts w:ascii="Calibri" w:hAnsi="Calibri"/>
           <w:b/>
           <w:i w:val="0"/>
-          <w:color w:val="0F2740"/>
+          <w:color w:val="003C54"/>
           <w:sz w:val="22"/>
         </w:rPr>
         <w:t xml:space="preserve">Menos trabalho braçal — </w:t>
@@ -2341,7 +2341,7 @@
           <w:rFonts w:ascii="Calibri" w:hAnsi="Calibri"/>
           <w:b/>
           <w:i w:val="0"/>
-          <w:color w:val="0F2740"/>
+          <w:color w:val="003C54"/>
           <w:sz w:val="22"/>
         </w:rPr>
         <w:t xml:space="preserve">Flexibilidade — </w:t>
@@ -2367,7 +2367,7 @@
           <w:rFonts w:ascii="Calibri" w:hAnsi="Calibri"/>
           <w:b/>
           <w:i w:val="0"/>
-          <w:color w:val="0F2740"/>
+          <w:color w:val="003C54"/>
           <w:sz w:val="22"/>
         </w:rPr>
         <w:t xml:space="preserve">Apoio constante — </w:t>
@@ -2392,7 +2392,7 @@
           <w:rFonts w:ascii="Calibri" w:hAnsi="Calibri"/>
           <w:b/>
           <w:i w:val="0"/>
-          <w:color w:val="1F6FEB"/>
+          <w:color w:val="0E6E92"/>
           <w:sz w:val="24"/>
         </w:rPr>
         <w:t>Mais segurança psicológica</w:t>
@@ -2423,7 +2423,7 @@
           <w:rFonts w:ascii="Calibri" w:hAnsi="Calibri"/>
           <w:b/>
           <w:i w:val="0"/>
-          <w:color w:val="0F2740"/>
+          <w:color w:val="003C54"/>
           <w:sz w:val="22"/>
         </w:rPr>
         <w:t xml:space="preserve">Tirar dúvidas sem julgamento — </w:t>
@@ -2449,7 +2449,7 @@
           <w:rFonts w:ascii="Calibri" w:hAnsi="Calibri"/>
           <w:b/>
           <w:i w:val="0"/>
-          <w:color w:val="0F2740"/>
+          <w:color w:val="003C54"/>
           <w:sz w:val="22"/>
         </w:rPr>
         <w:t xml:space="preserve">O erro fica no rascunho — </w:t>
@@ -2475,7 +2475,7 @@
           <w:rFonts w:ascii="Calibri" w:hAnsi="Calibri"/>
           <w:b/>
           <w:i w:val="0"/>
-          <w:color w:val="0F2740"/>
+          <w:color w:val="003C54"/>
           <w:sz w:val="22"/>
         </w:rPr>
         <w:t xml:space="preserve">Aumenta, não vigia — </w:t>
@@ -2511,7 +2511,7 @@
         <w:tc>
           <w:tcPr>
             <w:tcW w:type="dxa" w:w="9648"/>
-            <w:shd w:val="clear" w:fill="E6F7F6"/>
+            <w:shd w:val="clear" w:fill="E1F0F4"/>
             <w:tcMar>
               <w:top w:w="140" w:type="dxa"/>
               <w:bottom w:w="140" w:type="dxa"/>
@@ -2528,7 +2528,7 @@
                 <w:rFonts w:ascii="Calibri" w:hAnsi="Calibri"/>
                 <w:b/>
                 <w:i w:val="0"/>
-                <w:color w:val="0F2740"/>
+                <w:color w:val="003C54"/>
                 <w:sz w:val="22"/>
               </w:rPr>
               <w:t xml:space="preserve">Efeito no clima:  </w:t>
@@ -2556,7 +2556,7 @@
       <w:pPr>
         <w:spacing w:before="320" w:after="120"/>
         <w:pBdr>
-          <w:bottom w:val="single" w:sz="6" w:space="4" w:color="D8E2EC"/>
+          <w:bottom w:val="single" w:sz="6" w:space="4" w:color="D2E2EC"/>
         </w:pBdr>
       </w:pPr>
       <w:r>
@@ -2564,7 +2564,7 @@
           <w:rFonts w:ascii="Calibri" w:hAnsi="Calibri"/>
           <w:b/>
           <w:i w:val="0"/>
-          <w:color w:val="0FB5AE"/>
+          <w:color w:val="1F97B4"/>
           <w:sz w:val="30"/>
         </w:rPr>
         <w:t xml:space="preserve">7  </w:t>
@@ -2574,7 +2574,7 @@
           <w:rFonts w:ascii="Calibri" w:hAnsi="Calibri"/>
           <w:b/>
           <w:i w:val="0"/>
-          <w:color w:val="0F2740"/>
+          <w:color w:val="003C54"/>
           <w:sz w:val="30"/>
         </w:rPr>
         <w:t>Segurança e governança — não-negociável</w:t>
@@ -2605,7 +2605,7 @@
           <w:rFonts w:ascii="Calibri" w:hAnsi="Calibri"/>
           <w:b/>
           <w:i w:val="0"/>
-          <w:color w:val="0F2740"/>
+          <w:color w:val="003C54"/>
           <w:sz w:val="22"/>
         </w:rPr>
         <w:t xml:space="preserve">Identidade única (SSO) — </w:t>
@@ -2631,7 +2631,7 @@
           <w:rFonts w:ascii="Calibri" w:hAnsi="Calibri"/>
           <w:b/>
           <w:i w:val="0"/>
-          <w:color w:val="0F2740"/>
+          <w:color w:val="003C54"/>
           <w:sz w:val="22"/>
         </w:rPr>
         <w:t xml:space="preserve">Permissões mínimas — </w:t>
@@ -2657,7 +2657,7 @@
           <w:rFonts w:ascii="Calibri" w:hAnsi="Calibri"/>
           <w:b/>
           <w:i w:val="0"/>
-          <w:color w:val="0F2740"/>
+          <w:color w:val="003C54"/>
           <w:sz w:val="22"/>
         </w:rPr>
         <w:t xml:space="preserve">Aprovação de ações externas — </w:t>
@@ -2683,7 +2683,7 @@
           <w:rFonts w:ascii="Calibri" w:hAnsi="Calibri"/>
           <w:b/>
           <w:i w:val="0"/>
-          <w:color w:val="0F2740"/>
+          <w:color w:val="003C54"/>
           <w:sz w:val="22"/>
         </w:rPr>
         <w:t xml:space="preserve">Segredos protegidos — </w:t>
@@ -2709,7 +2709,7 @@
           <w:rFonts w:ascii="Calibri" w:hAnsi="Calibri"/>
           <w:b/>
           <w:i w:val="0"/>
-          <w:color w:val="0F2740"/>
+          <w:color w:val="003C54"/>
           <w:sz w:val="22"/>
         </w:rPr>
         <w:t xml:space="preserve">Auditoria completa — </w:t>
@@ -2735,7 +2735,7 @@
           <w:rFonts w:ascii="Calibri" w:hAnsi="Calibri"/>
           <w:b/>
           <w:i w:val="0"/>
-          <w:color w:val="0F2740"/>
+          <w:color w:val="003C54"/>
           <w:sz w:val="22"/>
         </w:rPr>
         <w:t xml:space="preserve">Isolamento de dados — </w:t>
@@ -2755,7 +2755,7 @@
       <w:pPr>
         <w:spacing w:before="320" w:after="120"/>
         <w:pBdr>
-          <w:bottom w:val="single" w:sz="6" w:space="4" w:color="D8E2EC"/>
+          <w:bottom w:val="single" w:sz="6" w:space="4" w:color="D2E2EC"/>
         </w:pBdr>
       </w:pPr>
       <w:r>
@@ -2763,7 +2763,7 @@
           <w:rFonts w:ascii="Calibri" w:hAnsi="Calibri"/>
           <w:b/>
           <w:i w:val="0"/>
-          <w:color w:val="0FB5AE"/>
+          <w:color w:val="1F97B4"/>
           <w:sz w:val="30"/>
         </w:rPr>
         <w:t xml:space="preserve">8  </w:t>
@@ -2773,7 +2773,7 @@
           <w:rFonts w:ascii="Calibri" w:hAnsi="Calibri"/>
           <w:b/>
           <w:i w:val="0"/>
-          <w:color w:val="0F2740"/>
+          <w:color w:val="003C54"/>
           <w:sz w:val="30"/>
         </w:rPr>
         <w:t>O que já existe e o que falta construir</w:t>
@@ -2803,7 +2803,7 @@
           <w:rFonts w:ascii="Calibri" w:hAnsi="Calibri"/>
           <w:b/>
           <w:i w:val="0"/>
-          <w:color w:val="1F6FEB"/>
+          <w:color w:val="0E6E92"/>
           <w:sz w:val="24"/>
         </w:rPr>
         <w:t>Já disponível</w:t>
@@ -2819,7 +2819,7 @@
           <w:rFonts w:ascii="Calibri" w:hAnsi="Calibri"/>
           <w:b/>
           <w:i w:val="0"/>
-          <w:color w:val="0F2740"/>
+          <w:color w:val="003C54"/>
           <w:sz w:val="22"/>
         </w:rPr>
         <w:t xml:space="preserve">WhatsApp — </w:t>
@@ -2845,7 +2845,7 @@
           <w:rFonts w:ascii="Calibri" w:hAnsi="Calibri"/>
           <w:b/>
           <w:i w:val="0"/>
-          <w:color w:val="0F2740"/>
+          <w:color w:val="003C54"/>
           <w:sz w:val="22"/>
         </w:rPr>
         <w:t xml:space="preserve">Google Workspace — </w:t>
@@ -2871,7 +2871,7 @@
           <w:rFonts w:ascii="Calibri" w:hAnsi="Calibri"/>
           <w:b/>
           <w:i w:val="0"/>
-          <w:color w:val="0F2740"/>
+          <w:color w:val="003C54"/>
           <w:sz w:val="22"/>
         </w:rPr>
         <w:t xml:space="preserve">Sistemas internos — </w:t>
@@ -2897,7 +2897,7 @@
           <w:rFonts w:ascii="Calibri" w:hAnsi="Calibri"/>
           <w:b/>
           <w:i w:val="0"/>
-          <w:color w:val="0F2740"/>
+          <w:color w:val="003C54"/>
           <w:sz w:val="22"/>
         </w:rPr>
         <w:t xml:space="preserve">computer-use e GitHub — </w:t>
@@ -2922,7 +2922,7 @@
           <w:rFonts w:ascii="Calibri" w:hAnsi="Calibri"/>
           <w:b/>
           <w:i w:val="0"/>
-          <w:color w:val="1F6FEB"/>
+          <w:color w:val="0E6E92"/>
           <w:sz w:val="24"/>
         </w:rPr>
         <w:t>A construir</w:t>
@@ -2948,7 +2948,7 @@
       <w:pPr>
         <w:spacing w:before="320" w:after="120"/>
         <w:pBdr>
-          <w:bottom w:val="single" w:sz="6" w:space="4" w:color="D8E2EC"/>
+          <w:bottom w:val="single" w:sz="6" w:space="4" w:color="D2E2EC"/>
         </w:pBdr>
       </w:pPr>
       <w:r>
@@ -2956,7 +2956,7 @@
           <w:rFonts w:ascii="Calibri" w:hAnsi="Calibri"/>
           <w:b/>
           <w:i w:val="0"/>
-          <w:color w:val="0FB5AE"/>
+          <w:color w:val="1F97B4"/>
           <w:sz w:val="30"/>
         </w:rPr>
         <w:t xml:space="preserve">9  </w:t>
@@ -2966,7 +2966,7 @@
           <w:rFonts w:ascii="Calibri" w:hAnsi="Calibri"/>
           <w:b/>
           <w:i w:val="0"/>
-          <w:color w:val="0F2740"/>
+          <w:color w:val="003C54"/>
           <w:sz w:val="30"/>
         </w:rPr>
         <w:t>Roadmap de implantação</w:t>
@@ -3022,7 +3022,7 @@
           <w:rFonts w:ascii="Calibri" w:hAnsi="Calibri"/>
           <w:b w:val="0"/>
           <w:i/>
-          <w:color w:val="5B6B7B"/>
+          <w:color w:val="5E6A72"/>
           <w:sz w:val="18"/>
         </w:rPr>
         <w:t>Figura 5 — Implantação faseada, do alicerce à otimização contínua.</w:t>
@@ -3037,7 +3037,7 @@
       <w:pPr>
         <w:spacing w:before="320" w:after="120"/>
         <w:pBdr>
-          <w:bottom w:val="single" w:sz="6" w:space="4" w:color="D8E2EC"/>
+          <w:bottom w:val="single" w:sz="6" w:space="4" w:color="D2E2EC"/>
         </w:pBdr>
       </w:pPr>
       <w:r>
@@ -3045,7 +3045,7 @@
           <w:rFonts w:ascii="Calibri" w:hAnsi="Calibri"/>
           <w:b/>
           <w:i w:val="0"/>
-          <w:color w:val="0FB5AE"/>
+          <w:color w:val="1F97B4"/>
           <w:sz w:val="30"/>
         </w:rPr>
         <w:t xml:space="preserve">10  </w:t>
@@ -3055,7 +3055,7 @@
           <w:rFonts w:ascii="Calibri" w:hAnsi="Calibri"/>
           <w:b/>
           <w:i w:val="0"/>
-          <w:color w:val="0F2740"/>
+          <w:color w:val="003C54"/>
           <w:sz w:val="30"/>
         </w:rPr>
         <w:t>Indicadores de acompanhamento</w:t>
@@ -3126,7 +3126,7 @@
           <w:rFonts w:ascii="Calibri" w:hAnsi="Calibri"/>
           <w:b w:val="0"/>
           <w:i/>
-          <w:color w:val="5B6B7B"/>
+          <w:color w:val="5E6A72"/>
           <w:sz w:val="18"/>
         </w:rPr>
         <w:t>Figura 6 — Domínios de indicadores; valores definidos a partir da medição inicial.</w:t>
@@ -3157,7 +3157,7 @@
         <w:tc>
           <w:tcPr>
             <w:tcW w:type="dxa" w:w="9648"/>
-            <w:shd w:val="clear" w:fill="0F2740"/>
+            <w:shd w:val="clear" w:fill="003C54"/>
             <w:tcMar>
               <w:top w:w="160" w:type="dxa"/>
               <w:bottom w:w="160" w:type="dxa"/>
@@ -3175,7 +3175,7 @@
                 <w:rFonts w:ascii="Calibri" w:hAnsi="Calibri"/>
                 <w:b/>
                 <w:i w:val="0"/>
-                <w:color w:val="0FB5AE"/>
+                <w:color w:val="1F97B4"/>
                 <w:sz w:val="24"/>
               </w:rPr>
               <w:t xml:space="preserve">Em uma frase:  </w:t>
@@ -3210,6 +3210,46 @@
   <w:p>
     <w:pPr>
       <w:pStyle w:val="Footer"/>
+      <w:spacing w:after="0"/>
+      <w:jc w:val="left"/>
+    </w:pPr>
+    <w:r>
+      <w:drawing>
+        <wp:inline xmlns:a="http://schemas.openxmlformats.org/drawingml/2006/main" xmlns:pic="http://schemas.openxmlformats.org/drawingml/2006/picture">
+          <wp:extent cx="470263" cy="146304"/>
+          <wp:docPr id="1" name="Picture 1"/>
+          <wp:cNvGraphicFramePr>
+            <a:graphicFrameLocks noChangeAspect="1"/>
+          </wp:cNvGraphicFramePr>
+          <a:graphic>
+            <a:graphicData uri="http://schemas.openxmlformats.org/drawingml/2006/picture">
+              <pic:pic>
+                <pic:nvPicPr>
+                  <pic:cNvPr id="0" name="setup_logo@hi.png"/>
+                  <pic:cNvPicPr/>
+                </pic:nvPicPr>
+                <pic:blipFill>
+                  <a:blip r:embed="rId1"/>
+                  <a:stretch>
+                    <a:fillRect/>
+                  </a:stretch>
+                </pic:blipFill>
+                <pic:spPr>
+                  <a:xfrm>
+                    <a:off x="0" y="0"/>
+                    <a:ext cx="470263" cy="146304"/>
+                  </a:xfrm>
+                  <a:prstGeom prst="rect"/>
+                </pic:spPr>
+              </pic:pic>
+            </a:graphicData>
+          </a:graphic>
+        </wp:inline>
+      </w:drawing>
+    </w:r>
+  </w:p>
+  <w:p>
+    <w:pPr>
       <w:jc w:val="center"/>
     </w:pPr>
     <w:r>
@@ -3217,7 +3257,7 @@
         <w:rFonts w:ascii="Calibri" w:hAnsi="Calibri"/>
         <w:b w:val="0"/>
         <w:i w:val="0"/>
-        <w:color w:val="5B6B7B"/>
+        <w:color w:val="5E6A72"/>
         <w:sz w:val="16"/>
       </w:rPr>
       <w:t xml:space="preserve">setup.com.br · Infraestrutura de TI com IA · Documento Executivo · </w:t>

</xml_diff>